<commit_message>
Update resume end date to 10 September 2026
Co-authored-by: Sonaal8 <Sonaal8@users.noreply.github.com>
</commit_message>
<xml_diff>
--- a/job-prep-docs/SONAAL_TOPNO_Resume.docx
+++ b/job-prep-docs/SONAAL_TOPNO_Resume.docx
@@ -253,7 +253,7 @@
                 <w:color w:val="5A6578"/>
                 <w:sz w:val="20"/>
               </w:rPr>
-              <w:t>07/2022 - Present</w:t>
+              <w:t>07/2022 - 10/09/2026</w:t>
             </w:r>
           </w:p>
         </w:tc>
@@ -286,7 +286,7 @@
           <w:color w:val="5A6578"/>
           <w:sz w:val="21"/>
         </w:rPr>
-        <w:t>Marketing &amp; Insights — Sportsbet, APAC (10/2025 - Present)</w:t>
+        <w:t>Marketing &amp; Insights — Sportsbet, APAC (10/2025 - 10/09/2026)</w:t>
       </w:r>
     </w:p>
     <w:p>

</xml_diff>